<commit_message>
Added fields for TrainPEC type logs
</commit_message>
<xml_diff>
--- a/GuideLogAnalyzer/GuideLogAnalyzerDescription.docx
+++ b/GuideLogAnalyzer/GuideLogAnalyzerDescription.docx
@@ -1,6 +1,6 @@
 
 <file path=word/document.xml><?xml version="1.0" encoding="utf-8"?>
-<w:document xmlns:wpc="http://schemas.microsoft.com/office/word/2010/wordprocessingCanvas" xmlns:cx="http://schemas.microsoft.com/office/drawing/2014/chartex" xmlns:cx1="http://schemas.microsoft.com/office/drawing/2015/9/8/chartex" xmlns:cx2="http://schemas.microsoft.com/office/drawing/2015/10/21/chartex" xmlns:cx3="http://schemas.microsoft.com/office/drawing/2016/5/9/chartex" xmlns:cx4="http://schemas.microsoft.com/office/drawing/2016/5/10/chartex" xmlns:cx5="http://schemas.microsoft.com/office/drawing/2016/5/11/chartex" xmlns:cx6="http://schemas.microsoft.com/office/drawing/2016/5/12/chartex" xmlns:cx7="http://schemas.microsoft.com/office/drawing/2016/5/13/chartex" xmlns:cx8="http://schemas.microsoft.com/office/drawing/2016/5/14/chartex" xmlns:mc="http://schemas.openxmlformats.org/markup-compatibility/2006" xmlns:aink="http://schemas.microsoft.com/office/drawing/2016/ink" xmlns:am3d="http://schemas.microsoft.com/office/drawing/2017/model3d" xmlns:o="urn:schemas-microsoft-com:office:office" xmlns:r="http://schemas.openxmlformats.org/officeDocument/2006/relationships" xmlns:m="http://schemas.openxmlformats.org/officeDocument/2006/math" xmlns:v="urn:schemas-microsoft-com:vml" xmlns:wp14="http://schemas.microsoft.com/office/word/2010/wordprocessingDrawing" xmlns:wp="http://schemas.openxmlformats.org/drawingml/2006/wordprocessingDrawing" xmlns:w10="urn:schemas-microsoft-com:office:word" xmlns:w="http://schemas.openxmlformats.org/wordprocessingml/2006/main" xmlns:w14="http://schemas.microsoft.com/office/word/2010/wordml" xmlns:w15="http://schemas.microsoft.com/office/word/2012/wordml" xmlns:w16cex="http://schemas.microsoft.com/office/word/2018/wordml/cex" xmlns:w16cid="http://schemas.microsoft.com/office/word/2016/wordml/cid" xmlns:w16="http://schemas.microsoft.com/office/word/2018/wordml" xmlns:w16se="http://schemas.microsoft.com/office/word/2015/wordml/symex" xmlns:wpg="http://schemas.microsoft.com/office/word/2010/wordprocessingGroup" xmlns:wpi="http://schemas.microsoft.com/office/word/2010/wordprocessingInk" xmlns:wne="http://schemas.microsoft.com/office/word/2006/wordml" xmlns:wps="http://schemas.microsoft.com/office/word/2010/wordprocessingShape" mc:Ignorable="w14 w15 w16se w16cid w16 w16cex wp14">
+<w:document xmlns:wpc="http://schemas.microsoft.com/office/word/2010/wordprocessingCanvas" xmlns:cx="http://schemas.microsoft.com/office/drawing/2014/chartex" xmlns:cx1="http://schemas.microsoft.com/office/drawing/2015/9/8/chartex" xmlns:cx2="http://schemas.microsoft.com/office/drawing/2015/10/21/chartex" xmlns:cx3="http://schemas.microsoft.com/office/drawing/2016/5/9/chartex" xmlns:cx4="http://schemas.microsoft.com/office/drawing/2016/5/10/chartex" xmlns:cx5="http://schemas.microsoft.com/office/drawing/2016/5/11/chartex" xmlns:cx6="http://schemas.microsoft.com/office/drawing/2016/5/12/chartex" xmlns:cx7="http://schemas.microsoft.com/office/drawing/2016/5/13/chartex" xmlns:cx8="http://schemas.microsoft.com/office/drawing/2016/5/14/chartex" xmlns:mc="http://schemas.openxmlformats.org/markup-compatibility/2006" xmlns:aink="http://schemas.microsoft.com/office/drawing/2016/ink" xmlns:am3d="http://schemas.microsoft.com/office/drawing/2017/model3d" xmlns:o="urn:schemas-microsoft-com:office:office" xmlns:oel="http://schemas.microsoft.com/office/2019/extlst" xmlns:r="http://schemas.openxmlformats.org/officeDocument/2006/relationships" xmlns:m="http://schemas.openxmlformats.org/officeDocument/2006/math" xmlns:v="urn:schemas-microsoft-com:vml" xmlns:wp14="http://schemas.microsoft.com/office/word/2010/wordprocessingDrawing" xmlns:wp="http://schemas.openxmlformats.org/drawingml/2006/wordprocessingDrawing" xmlns:w10="urn:schemas-microsoft-com:office:word" xmlns:w="http://schemas.openxmlformats.org/wordprocessingml/2006/main" xmlns:w14="http://schemas.microsoft.com/office/word/2010/wordml" xmlns:w15="http://schemas.microsoft.com/office/word/2012/wordml" xmlns:w16cex="http://schemas.microsoft.com/office/word/2018/wordml/cex" xmlns:w16cid="http://schemas.microsoft.com/office/word/2016/wordml/cid" xmlns:w16="http://schemas.microsoft.com/office/word/2018/wordml" xmlns:w16du="http://schemas.microsoft.com/office/word/2023/wordml/word16du" xmlns:w16sdtdh="http://schemas.microsoft.com/office/word/2020/wordml/sdtdatahash" xmlns:w16sdtfl="http://schemas.microsoft.com/office/word/2024/wordml/sdtformatlock" xmlns:w16se="http://schemas.microsoft.com/office/word/2015/wordml/symex" xmlns:wpg="http://schemas.microsoft.com/office/word/2010/wordprocessingGroup" xmlns:wpi="http://schemas.microsoft.com/office/word/2010/wordprocessingInk" xmlns:wne="http://schemas.microsoft.com/office/word/2006/wordml" xmlns:wps="http://schemas.microsoft.com/office/word/2010/wordprocessingShape" mc:Ignorable="w14 w15 w16se w16cid w16 w16cex w16sdtdh w16sdtfl w16du wp14">
   <w:body>
     <w:p>
       <w:pPr>
@@ -129,23 +129,7 @@
           <w:rFonts w:ascii="Arial" w:eastAsia="Arial" w:hAnsi="Arial" w:cs="Arial"/>
           <w:sz w:val="24"/>
         </w:rPr>
-        <w:t xml:space="preserve">Guide Log Profiler graphs </w:t>
-      </w:r>
-      <w:proofErr w:type="spellStart"/>
-      <w:r>
-        <w:rPr>
-          <w:rFonts w:ascii="Arial" w:eastAsia="Arial" w:hAnsi="Arial" w:cs="Arial"/>
-          <w:sz w:val="24"/>
-        </w:rPr>
-        <w:t>TheSkyX</w:t>
-      </w:r>
-      <w:proofErr w:type="spellEnd"/>
-      <w:r>
-        <w:rPr>
-          <w:rFonts w:ascii="Arial" w:eastAsia="Arial" w:hAnsi="Arial" w:cs="Arial"/>
-          <w:sz w:val="24"/>
-        </w:rPr>
-        <w:t xml:space="preserve"> guide</w:t>
+        <w:t>Guide Log Profiler graphs TheSkyX guide</w:t>
       </w:r>
       <w:r>
         <w:rPr>
@@ -159,23 +143,7 @@
           <w:rFonts w:ascii="Arial" w:eastAsia="Arial" w:hAnsi="Arial" w:cs="Arial"/>
           <w:sz w:val="24"/>
         </w:rPr>
-        <w:t xml:space="preserve"> log file error correction data in both time and </w:t>
-      </w:r>
-      <w:proofErr w:type="gramStart"/>
-      <w:r>
-        <w:rPr>
-          <w:rFonts w:ascii="Arial" w:eastAsia="Arial" w:hAnsi="Arial" w:cs="Arial"/>
-          <w:sz w:val="24"/>
-        </w:rPr>
-        <w:t>frequency, and</w:t>
-      </w:r>
-      <w:proofErr w:type="gramEnd"/>
-      <w:r>
-        <w:rPr>
-          <w:rFonts w:ascii="Arial" w:eastAsia="Arial" w:hAnsi="Arial" w:cs="Arial"/>
-          <w:sz w:val="24"/>
-        </w:rPr>
-        <w:t xml:space="preserve"> calculates some overall properties of the logged guiding behavior.  As such, this tool can be used to examine guider effectiveness, contrast the effects of different guider control configurations, compare before and after PEC training, and characterize the behavior of tracking inaccuracies such as caused by mechanical problems.</w:t>
+        <w:t xml:space="preserve"> log file error correction data in both time and frequency, and calculates some overall properties of the logged guiding behavior.  As such, this tool can be used to examine guider effectiveness, contrast the effects of different guider control configurations, compare before and after PEC training, and characterize the behavior of tracking inaccuracies such as caused by mechanical problems.</w:t>
       </w:r>
     </w:p>
     <w:p>
@@ -198,10 +166,10 @@
           <w:sz w:val="24"/>
         </w:rPr>
         <w:drawing>
-          <wp:inline distT="0" distB="0" distL="0" distR="0" wp14:anchorId="12A94F99" wp14:editId="6179C018">
-            <wp:extent cx="5943600" cy="4302125"/>
+          <wp:inline distT="0" distB="0" distL="0" distR="0" wp14:anchorId="65ED4B25" wp14:editId="09A7A5D1">
+            <wp:extent cx="5943600" cy="4586605"/>
             <wp:effectExtent l="0" t="0" r="0" b="0"/>
-            <wp:docPr id="1" name="Picture 1"/>
+            <wp:docPr id="71164282" name="Picture 1" descr="A screenshot of a computer&#10;&#10;AI-generated content may be incorrect."/>
             <wp:cNvGraphicFramePr>
               <a:graphicFrameLocks xmlns:a="http://schemas.openxmlformats.org/drawingml/2006/main" noChangeAspect="1"/>
             </wp:cNvGraphicFramePr>
@@ -209,7 +177,7 @@
               <a:graphicData uri="http://schemas.openxmlformats.org/drawingml/2006/picture">
                 <pic:pic xmlns:pic="http://schemas.openxmlformats.org/drawingml/2006/picture">
                   <pic:nvPicPr>
-                    <pic:cNvPr id="1" name=""/>
+                    <pic:cNvPr id="71164282" name="Picture 1" descr="A screenshot of a computer&#10;&#10;AI-generated content may be incorrect."/>
                     <pic:cNvPicPr/>
                   </pic:nvPicPr>
                   <pic:blipFill>
@@ -221,7 +189,7 @@
                   <pic:spPr>
                     <a:xfrm>
                       <a:off x="0" y="0"/>
-                      <a:ext cx="5943600" cy="4302125"/>
+                      <a:ext cx="5943600" cy="4586605"/>
                     </a:xfrm>
                     <a:prstGeom prst="rect">
                       <a:avLst/>
@@ -233,8 +201,6 @@
           </wp:inline>
         </w:drawing>
       </w:r>
-      <w:bookmarkStart w:id="0" w:name="_GoBack"/>
-      <w:bookmarkEnd w:id="0"/>
     </w:p>
     <w:p>
       <w:pPr>
@@ -337,23 +303,7 @@
           <w:rFonts w:ascii="Arial" w:eastAsia="Arial" w:hAnsi="Arial" w:cs="Arial"/>
           <w:sz w:val="24"/>
         </w:rPr>
-        <w:t xml:space="preserve">positive direction for each vector.   TSX guider logs do not contain AO calibration vector information </w:t>
-      </w:r>
-      <w:proofErr w:type="gramStart"/>
-      <w:r>
-        <w:rPr>
-          <w:rFonts w:ascii="Arial" w:eastAsia="Arial" w:hAnsi="Arial" w:cs="Arial"/>
-          <w:sz w:val="24"/>
-        </w:rPr>
-        <w:t>at this time</w:t>
-      </w:r>
-      <w:proofErr w:type="gramEnd"/>
-      <w:r>
-        <w:rPr>
-          <w:rFonts w:ascii="Arial" w:eastAsia="Arial" w:hAnsi="Arial" w:cs="Arial"/>
-          <w:sz w:val="24"/>
-        </w:rPr>
-        <w:t>.</w:t>
+        <w:t>positive direction for each vector.   TSX guider logs do not contain AO calibration vector information at this time.</w:t>
       </w:r>
     </w:p>
     <w:p>
@@ -377,21 +327,12 @@
         </w:rPr>
         <w:t xml:space="preserve"> Vertical bars in this graph mark where the fundamental and harmonic periodicities of the </w:t>
       </w:r>
-      <w:proofErr w:type="gramStart"/>
-      <w:r>
-        <w:rPr>
-          <w:rFonts w:ascii="Arial" w:eastAsia="Arial" w:hAnsi="Arial" w:cs="Arial"/>
-          <w:sz w:val="24"/>
-        </w:rPr>
-        <w:t>particular Paramount</w:t>
-      </w:r>
-      <w:proofErr w:type="gramEnd"/>
-      <w:r>
-        <w:rPr>
-          <w:rFonts w:ascii="Arial" w:eastAsia="Arial" w:hAnsi="Arial" w:cs="Arial"/>
-          <w:sz w:val="24"/>
-        </w:rPr>
-        <w:t xml:space="preserve"> lie. </w:t>
+      <w:r>
+        <w:rPr>
+          <w:rFonts w:ascii="Arial" w:eastAsia="Arial" w:hAnsi="Arial" w:cs="Arial"/>
+          <w:sz w:val="24"/>
+        </w:rPr>
+        <w:t xml:space="preserve">particular Paramount lie. </w:t>
       </w:r>
       <w:r>
         <w:rPr>
@@ -530,25 +471,7 @@
           <w:rFonts w:ascii="Arial" w:eastAsia="Arial" w:hAnsi="Arial" w:cs="Arial"/>
           <w:sz w:val="24"/>
         </w:rPr>
-        <w:t xml:space="preserve">Bracket is a calculation of the number of successive errors that bracket the zero position.  That is, if </w:t>
-      </w:r>
-      <w:proofErr w:type="spellStart"/>
-      <w:proofErr w:type="gramStart"/>
-      <w:r>
-        <w:rPr>
-          <w:rFonts w:ascii="Arial" w:eastAsia="Arial" w:hAnsi="Arial" w:cs="Arial"/>
-          <w:sz w:val="24"/>
-        </w:rPr>
-        <w:t>a</w:t>
-      </w:r>
-      <w:proofErr w:type="spellEnd"/>
-      <w:proofErr w:type="gramEnd"/>
-      <w:r>
-        <w:rPr>
-          <w:rFonts w:ascii="Arial" w:eastAsia="Arial" w:hAnsi="Arial" w:cs="Arial"/>
-          <w:sz w:val="24"/>
-        </w:rPr>
-        <w:t xml:space="preserve"> error is logged in the positive (or negative), then after correction is logged in the negative (or positive), then it is considered to "bracket" zero.  This is a sign that the guider may be over-correcting.</w:t>
+        <w:t>Bracket is a calculation of the number of successive errors that bracket the zero position.  That is, if a error is logged in the positive (or negative), then after correction is logged in the negative (or positive), then it is considered to "bracket" zero.  This is a sign that the guider may be over-correcting.</w:t>
       </w:r>
     </w:p>
     <w:p>
@@ -835,23 +758,7 @@
           <w:rFonts w:ascii="Arial" w:eastAsia="Arial" w:hAnsi="Arial" w:cs="Arial"/>
           <w:sz w:val="24"/>
         </w:rPr>
-        <w:t xml:space="preserve">% Corrected, in the Analysis section, displays correction statistics.  Note that </w:t>
-      </w:r>
-      <w:proofErr w:type="spellStart"/>
-      <w:r>
-        <w:rPr>
-          <w:rFonts w:ascii="Arial" w:eastAsia="Arial" w:hAnsi="Arial" w:cs="Arial"/>
-          <w:sz w:val="24"/>
-        </w:rPr>
-        <w:t>TheSkyX</w:t>
-      </w:r>
-      <w:proofErr w:type="spellEnd"/>
-      <w:r>
-        <w:rPr>
-          <w:rFonts w:ascii="Arial" w:eastAsia="Arial" w:hAnsi="Arial" w:cs="Arial"/>
-          <w:sz w:val="24"/>
-        </w:rPr>
-        <w:t xml:space="preserve"> does not log AO corrections so this section (and the next) will only show mount corrections while AO is enabled.  This section tabulates the number of non-zero </w:t>
+        <w:t xml:space="preserve">% Corrected, in the Analysis section, displays correction statistics.  Note that TheSkyX does not log AO corrections so this section (and the next) will only show mount corrections while AO is enabled.  This section tabulates the number of non-zero </w:t>
       </w:r>
       <w:r>
         <w:rPr>
@@ -904,23 +811,7 @@
           <w:rFonts w:ascii="Arial" w:eastAsia="Arial" w:hAnsi="Arial" w:cs="Arial"/>
           <w:sz w:val="24"/>
         </w:rPr>
-        <w:t xml:space="preserve">Undershoot is a condition where a correction is made in one direction followed by a second correction in the same direction.  Each undershoot may be a result of either seeing excursions or insufficient correction. If a large percentage of corrections are </w:t>
-      </w:r>
-      <w:proofErr w:type="gramStart"/>
-      <w:r>
-        <w:rPr>
-          <w:rFonts w:ascii="Arial" w:eastAsia="Arial" w:hAnsi="Arial" w:cs="Arial"/>
-          <w:sz w:val="24"/>
-        </w:rPr>
-        <w:t>undershoots</w:t>
-      </w:r>
-      <w:proofErr w:type="gramEnd"/>
-      <w:r>
-        <w:rPr>
-          <w:rFonts w:ascii="Arial" w:eastAsia="Arial" w:hAnsi="Arial" w:cs="Arial"/>
-          <w:sz w:val="24"/>
-        </w:rPr>
-        <w:t>, this suggests the latter.</w:t>
+        <w:t>Undershoot is a condition where a correction is made in one direction followed by a second correction in the same direction.  Each undershoot may be a result of either seeing excursions or insufficient correction. If a large percentage of corrections are undershoots, this suggests the latter.</w:t>
       </w:r>
     </w:p>
     <w:p>
@@ -991,39 +882,7 @@
           <w:rFonts w:ascii="Arial" w:eastAsia="Arial" w:hAnsi="Arial" w:cs="Arial"/>
           <w:sz w:val="24"/>
         </w:rPr>
-        <w:t xml:space="preserve"> a </w:t>
-      </w:r>
-      <w:proofErr w:type="spellStart"/>
-      <w:r>
-        <w:rPr>
-          <w:rFonts w:ascii="Arial" w:eastAsia="Arial" w:hAnsi="Arial" w:cs="Arial"/>
-          <w:sz w:val="24"/>
-        </w:rPr>
-        <w:t>TheSkyX</w:t>
-      </w:r>
-      <w:proofErr w:type="spellEnd"/>
-      <w:r>
-        <w:rPr>
-          <w:rFonts w:ascii="Arial" w:eastAsia="Arial" w:hAnsi="Arial" w:cs="Arial"/>
-          <w:sz w:val="24"/>
-        </w:rPr>
-        <w:t xml:space="preserve"> </w:t>
-      </w:r>
-      <w:proofErr w:type="spellStart"/>
-      <w:r>
-        <w:rPr>
-          <w:rFonts w:ascii="Arial" w:eastAsia="Arial" w:hAnsi="Arial" w:cs="Arial"/>
-          <w:sz w:val="24"/>
-        </w:rPr>
-        <w:t>Autoguide</w:t>
-      </w:r>
-      <w:proofErr w:type="spellEnd"/>
-      <w:r>
-        <w:rPr>
-          <w:rFonts w:ascii="Arial" w:eastAsia="Arial" w:hAnsi="Arial" w:cs="Arial"/>
-          <w:sz w:val="24"/>
-        </w:rPr>
-        <w:t xml:space="preserve"> Log file.</w:t>
+        <w:t xml:space="preserve"> a TheSkyX Autoguide Log file.</w:t>
       </w:r>
     </w:p>
     <w:p>
@@ -1207,23 +1066,7 @@
           <w:rFonts w:ascii="Arial" w:eastAsia="Arial" w:hAnsi="Arial" w:cs="Arial"/>
           <w:sz w:val="24"/>
         </w:rPr>
-        <w:t xml:space="preserve">Guide Log Analyzer is a Windows Forms executable, written in C#.  Guider Log files used by this app may, but not necessarily must, have been produced by </w:t>
-      </w:r>
-      <w:proofErr w:type="spellStart"/>
-      <w:r>
-        <w:rPr>
-          <w:rFonts w:ascii="Arial" w:eastAsia="Arial" w:hAnsi="Arial" w:cs="Arial"/>
-          <w:sz w:val="24"/>
-        </w:rPr>
-        <w:t>TheSkyX</w:t>
-      </w:r>
-      <w:proofErr w:type="spellEnd"/>
-      <w:r>
-        <w:rPr>
-          <w:rFonts w:ascii="Arial" w:eastAsia="Arial" w:hAnsi="Arial" w:cs="Arial"/>
-          <w:sz w:val="24"/>
-        </w:rPr>
-        <w:t xml:space="preserve"> Pro 10.5.0.  The application may also require installation of Microsoft </w:t>
+        <w:t xml:space="preserve">Guide Log Analyzer is a Windows Forms executable, written in C#.  Guider Log files used by this app may, but not necessarily must, have been produced by TheSkyX Pro 10.5.0.  The application may also require installation of Microsoft </w:t>
       </w:r>
       <w:r>
         <w:rPr>
@@ -1295,23 +1138,7 @@
           <w:rFonts w:ascii="Arial" w:eastAsia="Arial" w:hAnsi="Arial" w:cs="Arial"/>
           <w:sz w:val="24"/>
         </w:rPr>
-        <w:t>Download the GuideLogAnalyzer_Exe.zip and open. Run the "Setup" application.  Upon completion, an application icon will have been added to the start menu under "</w:t>
-      </w:r>
-      <w:proofErr w:type="spellStart"/>
-      <w:r>
-        <w:rPr>
-          <w:rFonts w:ascii="Arial" w:eastAsia="Arial" w:hAnsi="Arial" w:cs="Arial"/>
-          <w:sz w:val="24"/>
-        </w:rPr>
-        <w:t>TSXToolKit</w:t>
-      </w:r>
-      <w:proofErr w:type="spellEnd"/>
-      <w:r>
-        <w:rPr>
-          <w:rFonts w:ascii="Arial" w:eastAsia="Arial" w:hAnsi="Arial" w:cs="Arial"/>
-          <w:sz w:val="24"/>
-        </w:rPr>
-        <w:t>" with the name "Guide Log Analyzer".  This application can be pinned to the Start if desired.</w:t>
+        <w:t>Download the GuideLogAnalyzer_Exe.zip and open. Run the "Setup" application.  Upon completion, an application icon will have been added to the start menu under "TSXToolKit" with the name "Guide Log Analyzer".  This application can be pinned to the Start if desired.</w:t>
       </w:r>
     </w:p>
     <w:p>
@@ -1740,6 +1567,31 @@
         </w:rPr>
         <w:tab/>
         <w:t>Added field for percentage of samples saturated and lost.</w:t>
+      </w:r>
+    </w:p>
+    <w:p>
+      <w:pPr>
+        <w:keepNext/>
+        <w:keepLines/>
+        <w:rPr>
+          <w:rFonts w:ascii="Arial" w:eastAsia="Arial" w:hAnsi="Arial" w:cs="Arial"/>
+          <w:sz w:val="24"/>
+        </w:rPr>
+      </w:pPr>
+      <w:r>
+        <w:rPr>
+          <w:rFonts w:ascii="Arial" w:eastAsia="Arial" w:hAnsi="Arial" w:cs="Arial"/>
+          <w:sz w:val="24"/>
+        </w:rPr>
+        <w:t>1.8</w:t>
+      </w:r>
+      <w:r>
+        <w:rPr>
+          <w:rFonts w:ascii="Arial" w:eastAsia="Arial" w:hAnsi="Arial" w:cs="Arial"/>
+          <w:sz w:val="24"/>
+        </w:rPr>
+        <w:tab/>
+        <w:t>Added fields for TrainPEC logs</w:t>
       </w:r>
     </w:p>
     <w:p>
@@ -1764,7 +1616,7 @@
 </file>
 
 <file path=word/endnotes.xml><?xml version="1.0" encoding="utf-8"?>
-<w:endnotes xmlns:wpc="http://schemas.microsoft.com/office/word/2010/wordprocessingCanvas" xmlns:cx="http://schemas.microsoft.com/office/drawing/2014/chartex" xmlns:cx1="http://schemas.microsoft.com/office/drawing/2015/9/8/chartex" xmlns:cx2="http://schemas.microsoft.com/office/drawing/2015/10/21/chartex" xmlns:cx3="http://schemas.microsoft.com/office/drawing/2016/5/9/chartex" xmlns:cx4="http://schemas.microsoft.com/office/drawing/2016/5/10/chartex" xmlns:cx5="http://schemas.microsoft.com/office/drawing/2016/5/11/chartex" xmlns:cx6="http://schemas.microsoft.com/office/drawing/2016/5/12/chartex" xmlns:cx7="http://schemas.microsoft.com/office/drawing/2016/5/13/chartex" xmlns:cx8="http://schemas.microsoft.com/office/drawing/2016/5/14/chartex" xmlns:mc="http://schemas.openxmlformats.org/markup-compatibility/2006" xmlns:aink="http://schemas.microsoft.com/office/drawing/2016/ink" xmlns:am3d="http://schemas.microsoft.com/office/drawing/2017/model3d" xmlns:o="urn:schemas-microsoft-com:office:office" xmlns:r="http://schemas.openxmlformats.org/officeDocument/2006/relationships" xmlns:m="http://schemas.openxmlformats.org/officeDocument/2006/math" xmlns:v="urn:schemas-microsoft-com:vml" xmlns:wp14="http://schemas.microsoft.com/office/word/2010/wordprocessingDrawing" xmlns:wp="http://schemas.openxmlformats.org/drawingml/2006/wordprocessingDrawing" xmlns:w10="urn:schemas-microsoft-com:office:word" xmlns:w="http://schemas.openxmlformats.org/wordprocessingml/2006/main" xmlns:w14="http://schemas.microsoft.com/office/word/2010/wordml" xmlns:w15="http://schemas.microsoft.com/office/word/2012/wordml" xmlns:w16cex="http://schemas.microsoft.com/office/word/2018/wordml/cex" xmlns:w16cid="http://schemas.microsoft.com/office/word/2016/wordml/cid" xmlns:w16="http://schemas.microsoft.com/office/word/2018/wordml" xmlns:w16se="http://schemas.microsoft.com/office/word/2015/wordml/symex" xmlns:wpg="http://schemas.microsoft.com/office/word/2010/wordprocessingGroup" xmlns:wpi="http://schemas.microsoft.com/office/word/2010/wordprocessingInk" xmlns:wne="http://schemas.microsoft.com/office/word/2006/wordml" xmlns:wps="http://schemas.microsoft.com/office/word/2010/wordprocessingShape" mc:Ignorable="w14 w15 w16se w16cid w16 w16cex wp14">
+<w:endnotes xmlns:wpc="http://schemas.microsoft.com/office/word/2010/wordprocessingCanvas" xmlns:cx="http://schemas.microsoft.com/office/drawing/2014/chartex" xmlns:cx1="http://schemas.microsoft.com/office/drawing/2015/9/8/chartex" xmlns:cx2="http://schemas.microsoft.com/office/drawing/2015/10/21/chartex" xmlns:cx3="http://schemas.microsoft.com/office/drawing/2016/5/9/chartex" xmlns:cx4="http://schemas.microsoft.com/office/drawing/2016/5/10/chartex" xmlns:cx5="http://schemas.microsoft.com/office/drawing/2016/5/11/chartex" xmlns:cx6="http://schemas.microsoft.com/office/drawing/2016/5/12/chartex" xmlns:cx7="http://schemas.microsoft.com/office/drawing/2016/5/13/chartex" xmlns:cx8="http://schemas.microsoft.com/office/drawing/2016/5/14/chartex" xmlns:mc="http://schemas.openxmlformats.org/markup-compatibility/2006" xmlns:aink="http://schemas.microsoft.com/office/drawing/2016/ink" xmlns:am3d="http://schemas.microsoft.com/office/drawing/2017/model3d" xmlns:o="urn:schemas-microsoft-com:office:office" xmlns:oel="http://schemas.microsoft.com/office/2019/extlst" xmlns:r="http://schemas.openxmlformats.org/officeDocument/2006/relationships" xmlns:m="http://schemas.openxmlformats.org/officeDocument/2006/math" xmlns:v="urn:schemas-microsoft-com:vml" xmlns:wp14="http://schemas.microsoft.com/office/word/2010/wordprocessingDrawing" xmlns:wp="http://schemas.openxmlformats.org/drawingml/2006/wordprocessingDrawing" xmlns:w10="urn:schemas-microsoft-com:office:word" xmlns:w="http://schemas.openxmlformats.org/wordprocessingml/2006/main" xmlns:w14="http://schemas.microsoft.com/office/word/2010/wordml" xmlns:w15="http://schemas.microsoft.com/office/word/2012/wordml" xmlns:w16cex="http://schemas.microsoft.com/office/word/2018/wordml/cex" xmlns:w16cid="http://schemas.microsoft.com/office/word/2016/wordml/cid" xmlns:w16="http://schemas.microsoft.com/office/word/2018/wordml" xmlns:w16du="http://schemas.microsoft.com/office/word/2023/wordml/word16du" xmlns:w16sdtdh="http://schemas.microsoft.com/office/word/2020/wordml/sdtdatahash" xmlns:w16sdtfl="http://schemas.microsoft.com/office/word/2024/wordml/sdtformatlock" xmlns:w16se="http://schemas.microsoft.com/office/word/2015/wordml/symex" xmlns:wpg="http://schemas.microsoft.com/office/word/2010/wordprocessingGroup" xmlns:wpi="http://schemas.microsoft.com/office/word/2010/wordprocessingInk" xmlns:wne="http://schemas.microsoft.com/office/word/2006/wordml" xmlns:wps="http://schemas.microsoft.com/office/word/2010/wordprocessingShape" mc:Ignorable="w14 w15 w16se w16cid w16 w16cex w16sdtdh w16sdtfl w16du wp14">
   <w:endnote w:type="separator" w:id="-1">
     <w:p>
       <w:pPr>
@@ -1789,7 +1641,7 @@
 </file>
 
 <file path=word/footer1.xml><?xml version="1.0" encoding="utf-8"?>
-<w:ftr xmlns:wpc="http://schemas.microsoft.com/office/word/2010/wordprocessingCanvas" xmlns:cx="http://schemas.microsoft.com/office/drawing/2014/chartex" xmlns:cx1="http://schemas.microsoft.com/office/drawing/2015/9/8/chartex" xmlns:cx2="http://schemas.microsoft.com/office/drawing/2015/10/21/chartex" xmlns:cx3="http://schemas.microsoft.com/office/drawing/2016/5/9/chartex" xmlns:cx4="http://schemas.microsoft.com/office/drawing/2016/5/10/chartex" xmlns:cx5="http://schemas.microsoft.com/office/drawing/2016/5/11/chartex" xmlns:cx6="http://schemas.microsoft.com/office/drawing/2016/5/12/chartex" xmlns:cx7="http://schemas.microsoft.com/office/drawing/2016/5/13/chartex" xmlns:cx8="http://schemas.microsoft.com/office/drawing/2016/5/14/chartex" xmlns:mc="http://schemas.openxmlformats.org/markup-compatibility/2006" xmlns:aink="http://schemas.microsoft.com/office/drawing/2016/ink" xmlns:am3d="http://schemas.microsoft.com/office/drawing/2017/model3d" xmlns:o="urn:schemas-microsoft-com:office:office" xmlns:r="http://schemas.openxmlformats.org/officeDocument/2006/relationships" xmlns:m="http://schemas.openxmlformats.org/officeDocument/2006/math" xmlns:v="urn:schemas-microsoft-com:vml" xmlns:wp14="http://schemas.microsoft.com/office/word/2010/wordprocessingDrawing" xmlns:wp="http://schemas.openxmlformats.org/drawingml/2006/wordprocessingDrawing" xmlns:w10="urn:schemas-microsoft-com:office:word" xmlns:w="http://schemas.openxmlformats.org/wordprocessingml/2006/main" xmlns:w14="http://schemas.microsoft.com/office/word/2010/wordml" xmlns:w15="http://schemas.microsoft.com/office/word/2012/wordml" xmlns:w16cex="http://schemas.microsoft.com/office/word/2018/wordml/cex" xmlns:w16cid="http://schemas.microsoft.com/office/word/2016/wordml/cid" xmlns:w16="http://schemas.microsoft.com/office/word/2018/wordml" xmlns:w16se="http://schemas.microsoft.com/office/word/2015/wordml/symex" xmlns:wpg="http://schemas.microsoft.com/office/word/2010/wordprocessingGroup" xmlns:wpi="http://schemas.microsoft.com/office/word/2010/wordprocessingInk" xmlns:wne="http://schemas.microsoft.com/office/word/2006/wordml" xmlns:wps="http://schemas.microsoft.com/office/word/2010/wordprocessingShape" mc:Ignorable="w14 w15 w16se w16cid w16 w16cex wp14">
+<w:ftr xmlns:wpc="http://schemas.microsoft.com/office/word/2010/wordprocessingCanvas" xmlns:cx="http://schemas.microsoft.com/office/drawing/2014/chartex" xmlns:cx1="http://schemas.microsoft.com/office/drawing/2015/9/8/chartex" xmlns:cx2="http://schemas.microsoft.com/office/drawing/2015/10/21/chartex" xmlns:cx3="http://schemas.microsoft.com/office/drawing/2016/5/9/chartex" xmlns:cx4="http://schemas.microsoft.com/office/drawing/2016/5/10/chartex" xmlns:cx5="http://schemas.microsoft.com/office/drawing/2016/5/11/chartex" xmlns:cx6="http://schemas.microsoft.com/office/drawing/2016/5/12/chartex" xmlns:cx7="http://schemas.microsoft.com/office/drawing/2016/5/13/chartex" xmlns:cx8="http://schemas.microsoft.com/office/drawing/2016/5/14/chartex" xmlns:mc="http://schemas.openxmlformats.org/markup-compatibility/2006" xmlns:aink="http://schemas.microsoft.com/office/drawing/2016/ink" xmlns:am3d="http://schemas.microsoft.com/office/drawing/2017/model3d" xmlns:o="urn:schemas-microsoft-com:office:office" xmlns:oel="http://schemas.microsoft.com/office/2019/extlst" xmlns:r="http://schemas.openxmlformats.org/officeDocument/2006/relationships" xmlns:m="http://schemas.openxmlformats.org/officeDocument/2006/math" xmlns:v="urn:schemas-microsoft-com:vml" xmlns:wp14="http://schemas.microsoft.com/office/word/2010/wordprocessingDrawing" xmlns:wp="http://schemas.openxmlformats.org/drawingml/2006/wordprocessingDrawing" xmlns:w10="urn:schemas-microsoft-com:office:word" xmlns:w="http://schemas.openxmlformats.org/wordprocessingml/2006/main" xmlns:w14="http://schemas.microsoft.com/office/word/2010/wordml" xmlns:w15="http://schemas.microsoft.com/office/word/2012/wordml" xmlns:w16cex="http://schemas.microsoft.com/office/word/2018/wordml/cex" xmlns:w16cid="http://schemas.microsoft.com/office/word/2016/wordml/cid" xmlns:w16="http://schemas.microsoft.com/office/word/2018/wordml" xmlns:w16du="http://schemas.microsoft.com/office/word/2023/wordml/word16du" xmlns:w16sdtdh="http://schemas.microsoft.com/office/word/2020/wordml/sdtdatahash" xmlns:w16sdtfl="http://schemas.microsoft.com/office/word/2024/wordml/sdtformatlock" xmlns:w16se="http://schemas.microsoft.com/office/word/2015/wordml/symex" xmlns:wpg="http://schemas.microsoft.com/office/word/2010/wordprocessingGroup" xmlns:wpi="http://schemas.microsoft.com/office/word/2010/wordprocessingInk" xmlns:wne="http://schemas.microsoft.com/office/word/2006/wordml" xmlns:wps="http://schemas.microsoft.com/office/word/2010/wordprocessingShape" mc:Ignorable="w14 w15 w16se w16cid w16 w16cex w16sdtdh w16sdtfl w16du wp14">
   <w:p>
     <w:pPr>
       <w:pStyle w:val="Footer"/>
@@ -1802,7 +1654,7 @@
 </file>
 
 <file path=word/footnotes.xml><?xml version="1.0" encoding="utf-8"?>
-<w:footnotes xmlns:wpc="http://schemas.microsoft.com/office/word/2010/wordprocessingCanvas" xmlns:cx="http://schemas.microsoft.com/office/drawing/2014/chartex" xmlns:cx1="http://schemas.microsoft.com/office/drawing/2015/9/8/chartex" xmlns:cx2="http://schemas.microsoft.com/office/drawing/2015/10/21/chartex" xmlns:cx3="http://schemas.microsoft.com/office/drawing/2016/5/9/chartex" xmlns:cx4="http://schemas.microsoft.com/office/drawing/2016/5/10/chartex" xmlns:cx5="http://schemas.microsoft.com/office/drawing/2016/5/11/chartex" xmlns:cx6="http://schemas.microsoft.com/office/drawing/2016/5/12/chartex" xmlns:cx7="http://schemas.microsoft.com/office/drawing/2016/5/13/chartex" xmlns:cx8="http://schemas.microsoft.com/office/drawing/2016/5/14/chartex" xmlns:mc="http://schemas.openxmlformats.org/markup-compatibility/2006" xmlns:aink="http://schemas.microsoft.com/office/drawing/2016/ink" xmlns:am3d="http://schemas.microsoft.com/office/drawing/2017/model3d" xmlns:o="urn:schemas-microsoft-com:office:office" xmlns:r="http://schemas.openxmlformats.org/officeDocument/2006/relationships" xmlns:m="http://schemas.openxmlformats.org/officeDocument/2006/math" xmlns:v="urn:schemas-microsoft-com:vml" xmlns:wp14="http://schemas.microsoft.com/office/word/2010/wordprocessingDrawing" xmlns:wp="http://schemas.openxmlformats.org/drawingml/2006/wordprocessingDrawing" xmlns:w10="urn:schemas-microsoft-com:office:word" xmlns:w="http://schemas.openxmlformats.org/wordprocessingml/2006/main" xmlns:w14="http://schemas.microsoft.com/office/word/2010/wordml" xmlns:w15="http://schemas.microsoft.com/office/word/2012/wordml" xmlns:w16cex="http://schemas.microsoft.com/office/word/2018/wordml/cex" xmlns:w16cid="http://schemas.microsoft.com/office/word/2016/wordml/cid" xmlns:w16="http://schemas.microsoft.com/office/word/2018/wordml" xmlns:w16se="http://schemas.microsoft.com/office/word/2015/wordml/symex" xmlns:wpg="http://schemas.microsoft.com/office/word/2010/wordprocessingGroup" xmlns:wpi="http://schemas.microsoft.com/office/word/2010/wordprocessingInk" xmlns:wne="http://schemas.microsoft.com/office/word/2006/wordml" xmlns:wps="http://schemas.microsoft.com/office/word/2010/wordprocessingShape" mc:Ignorable="w14 w15 w16se w16cid w16 w16cex wp14">
+<w:footnotes xmlns:wpc="http://schemas.microsoft.com/office/word/2010/wordprocessingCanvas" xmlns:cx="http://schemas.microsoft.com/office/drawing/2014/chartex" xmlns:cx1="http://schemas.microsoft.com/office/drawing/2015/9/8/chartex" xmlns:cx2="http://schemas.microsoft.com/office/drawing/2015/10/21/chartex" xmlns:cx3="http://schemas.microsoft.com/office/drawing/2016/5/9/chartex" xmlns:cx4="http://schemas.microsoft.com/office/drawing/2016/5/10/chartex" xmlns:cx5="http://schemas.microsoft.com/office/drawing/2016/5/11/chartex" xmlns:cx6="http://schemas.microsoft.com/office/drawing/2016/5/12/chartex" xmlns:cx7="http://schemas.microsoft.com/office/drawing/2016/5/13/chartex" xmlns:cx8="http://schemas.microsoft.com/office/drawing/2016/5/14/chartex" xmlns:mc="http://schemas.openxmlformats.org/markup-compatibility/2006" xmlns:aink="http://schemas.microsoft.com/office/drawing/2016/ink" xmlns:am3d="http://schemas.microsoft.com/office/drawing/2017/model3d" xmlns:o="urn:schemas-microsoft-com:office:office" xmlns:oel="http://schemas.microsoft.com/office/2019/extlst" xmlns:r="http://schemas.openxmlformats.org/officeDocument/2006/relationships" xmlns:m="http://schemas.openxmlformats.org/officeDocument/2006/math" xmlns:v="urn:schemas-microsoft-com:vml" xmlns:wp14="http://schemas.microsoft.com/office/word/2010/wordprocessingDrawing" xmlns:wp="http://schemas.openxmlformats.org/drawingml/2006/wordprocessingDrawing" xmlns:w10="urn:schemas-microsoft-com:office:word" xmlns:w="http://schemas.openxmlformats.org/wordprocessingml/2006/main" xmlns:w14="http://schemas.microsoft.com/office/word/2010/wordml" xmlns:w15="http://schemas.microsoft.com/office/word/2012/wordml" xmlns:w16cex="http://schemas.microsoft.com/office/word/2018/wordml/cex" xmlns:w16cid="http://schemas.microsoft.com/office/word/2016/wordml/cid" xmlns:w16="http://schemas.microsoft.com/office/word/2018/wordml" xmlns:w16du="http://schemas.microsoft.com/office/word/2023/wordml/word16du" xmlns:w16sdtdh="http://schemas.microsoft.com/office/word/2020/wordml/sdtdatahash" xmlns:w16sdtfl="http://schemas.microsoft.com/office/word/2024/wordml/sdtformatlock" xmlns:w16se="http://schemas.microsoft.com/office/word/2015/wordml/symex" xmlns:wpg="http://schemas.microsoft.com/office/word/2010/wordprocessingGroup" xmlns:wpi="http://schemas.microsoft.com/office/word/2010/wordprocessingInk" xmlns:wne="http://schemas.microsoft.com/office/word/2006/wordml" xmlns:wps="http://schemas.microsoft.com/office/word/2010/wordprocessingShape" mc:Ignorable="w14 w15 w16se w16cid w16 w16cex w16sdtdh w16sdtfl w16du wp14">
   <w:footnote w:type="separator" w:id="-1">
     <w:p>
       <w:pPr>
@@ -1827,7 +1679,7 @@
 </file>
 
 <file path=word/numbering.xml><?xml version="1.0" encoding="utf-8"?>
-<w:numbering xmlns:wpc="http://schemas.microsoft.com/office/word/2010/wordprocessingCanvas" xmlns:cx="http://schemas.microsoft.com/office/drawing/2014/chartex" xmlns:cx1="http://schemas.microsoft.com/office/drawing/2015/9/8/chartex" xmlns:cx2="http://schemas.microsoft.com/office/drawing/2015/10/21/chartex" xmlns:cx3="http://schemas.microsoft.com/office/drawing/2016/5/9/chartex" xmlns:cx4="http://schemas.microsoft.com/office/drawing/2016/5/10/chartex" xmlns:cx5="http://schemas.microsoft.com/office/drawing/2016/5/11/chartex" xmlns:cx6="http://schemas.microsoft.com/office/drawing/2016/5/12/chartex" xmlns:cx7="http://schemas.microsoft.com/office/drawing/2016/5/13/chartex" xmlns:cx8="http://schemas.microsoft.com/office/drawing/2016/5/14/chartex" xmlns:mc="http://schemas.openxmlformats.org/markup-compatibility/2006" xmlns:aink="http://schemas.microsoft.com/office/drawing/2016/ink" xmlns:am3d="http://schemas.microsoft.com/office/drawing/2017/model3d" xmlns:o="urn:schemas-microsoft-com:office:office" xmlns:r="http://schemas.openxmlformats.org/officeDocument/2006/relationships" xmlns:m="http://schemas.openxmlformats.org/officeDocument/2006/math" xmlns:v="urn:schemas-microsoft-com:vml" xmlns:wp14="http://schemas.microsoft.com/office/word/2010/wordprocessingDrawing" xmlns:wp="http://schemas.openxmlformats.org/drawingml/2006/wordprocessingDrawing" xmlns:w10="urn:schemas-microsoft-com:office:word" xmlns:w="http://schemas.openxmlformats.org/wordprocessingml/2006/main" xmlns:w14="http://schemas.microsoft.com/office/word/2010/wordml" xmlns:w15="http://schemas.microsoft.com/office/word/2012/wordml" xmlns:w16cex="http://schemas.microsoft.com/office/word/2018/wordml/cex" xmlns:w16cid="http://schemas.microsoft.com/office/word/2016/wordml/cid" xmlns:w16="http://schemas.microsoft.com/office/word/2018/wordml" xmlns:w16se="http://schemas.microsoft.com/office/word/2015/wordml/symex" xmlns:wpg="http://schemas.microsoft.com/office/word/2010/wordprocessingGroup" xmlns:wpi="http://schemas.microsoft.com/office/word/2010/wordprocessingInk" xmlns:wne="http://schemas.microsoft.com/office/word/2006/wordml" xmlns:wps="http://schemas.microsoft.com/office/word/2010/wordprocessingShape" mc:Ignorable="w14 w15 w16se w16cid w16 w16cex wp14">
+<w:numbering xmlns:wpc="http://schemas.microsoft.com/office/word/2010/wordprocessingCanvas" xmlns:cx="http://schemas.microsoft.com/office/drawing/2014/chartex" xmlns:cx1="http://schemas.microsoft.com/office/drawing/2015/9/8/chartex" xmlns:cx2="http://schemas.microsoft.com/office/drawing/2015/10/21/chartex" xmlns:cx3="http://schemas.microsoft.com/office/drawing/2016/5/9/chartex" xmlns:cx4="http://schemas.microsoft.com/office/drawing/2016/5/10/chartex" xmlns:cx5="http://schemas.microsoft.com/office/drawing/2016/5/11/chartex" xmlns:cx6="http://schemas.microsoft.com/office/drawing/2016/5/12/chartex" xmlns:cx7="http://schemas.microsoft.com/office/drawing/2016/5/13/chartex" xmlns:cx8="http://schemas.microsoft.com/office/drawing/2016/5/14/chartex" xmlns:mc="http://schemas.openxmlformats.org/markup-compatibility/2006" xmlns:aink="http://schemas.microsoft.com/office/drawing/2016/ink" xmlns:am3d="http://schemas.microsoft.com/office/drawing/2017/model3d" xmlns:o="urn:schemas-microsoft-com:office:office" xmlns:oel="http://schemas.microsoft.com/office/2019/extlst" xmlns:r="http://schemas.openxmlformats.org/officeDocument/2006/relationships" xmlns:m="http://schemas.openxmlformats.org/officeDocument/2006/math" xmlns:v="urn:schemas-microsoft-com:vml" xmlns:wp14="http://schemas.microsoft.com/office/word/2010/wordprocessingDrawing" xmlns:wp="http://schemas.openxmlformats.org/drawingml/2006/wordprocessingDrawing" xmlns:w10="urn:schemas-microsoft-com:office:word" xmlns:w="http://schemas.openxmlformats.org/wordprocessingml/2006/main" xmlns:w14="http://schemas.microsoft.com/office/word/2010/wordml" xmlns:w15="http://schemas.microsoft.com/office/word/2012/wordml" xmlns:w16cex="http://schemas.microsoft.com/office/word/2018/wordml/cex" xmlns:w16cid="http://schemas.microsoft.com/office/word/2016/wordml/cid" xmlns:w16="http://schemas.microsoft.com/office/word/2018/wordml" xmlns:w16du="http://schemas.microsoft.com/office/word/2023/wordml/word16du" xmlns:w16sdtdh="http://schemas.microsoft.com/office/word/2020/wordml/sdtdatahash" xmlns:w16sdtfl="http://schemas.microsoft.com/office/word/2024/wordml/sdtformatlock" xmlns:w16se="http://schemas.microsoft.com/office/word/2015/wordml/symex" xmlns:wpg="http://schemas.microsoft.com/office/word/2010/wordprocessingGroup" xmlns:wpi="http://schemas.microsoft.com/office/word/2010/wordprocessingInk" xmlns:wne="http://schemas.microsoft.com/office/word/2006/wordml" xmlns:wps="http://schemas.microsoft.com/office/word/2010/wordprocessingShape" mc:Ignorable="w14 w15 w16se w16cid w16 w16cex w16sdtdh w16sdtfl w16du wp14">
   <w:abstractNum w:abstractNumId="0" w15:restartNumberingAfterBreak="0">
     <w:nsid w:val="073078E0"/>
     <w:multiLevelType w:val="multilevel"/>
@@ -2643,35 +2495,35 @@
       </w:rPr>
     </w:lvl>
   </w:abstractNum>
-  <w:num w:numId="1">
+  <w:num w:numId="1" w16cid:durableId="1924022054">
     <w:abstractNumId w:val="6"/>
   </w:num>
-  <w:num w:numId="2">
+  <w:num w:numId="2" w16cid:durableId="1539733205">
     <w:abstractNumId w:val="5"/>
   </w:num>
-  <w:num w:numId="3">
+  <w:num w:numId="3" w16cid:durableId="1503088589">
     <w:abstractNumId w:val="7"/>
   </w:num>
-  <w:num w:numId="4">
+  <w:num w:numId="4" w16cid:durableId="1571234913">
     <w:abstractNumId w:val="2"/>
   </w:num>
-  <w:num w:numId="5">
+  <w:num w:numId="5" w16cid:durableId="1843743031">
     <w:abstractNumId w:val="3"/>
   </w:num>
-  <w:num w:numId="6">
+  <w:num w:numId="6" w16cid:durableId="564992771">
     <w:abstractNumId w:val="0"/>
   </w:num>
-  <w:num w:numId="7">
+  <w:num w:numId="7" w16cid:durableId="635373544">
     <w:abstractNumId w:val="4"/>
   </w:num>
-  <w:num w:numId="8">
+  <w:num w:numId="8" w16cid:durableId="732579233">
     <w:abstractNumId w:val="1"/>
   </w:num>
 </w:numbering>
 </file>
 
 <file path=word/styles.xml><?xml version="1.0" encoding="utf-8"?>
-<w:styles xmlns:mc="http://schemas.openxmlformats.org/markup-compatibility/2006" xmlns:r="http://schemas.openxmlformats.org/officeDocument/2006/relationships" xmlns:w="http://schemas.openxmlformats.org/wordprocessingml/2006/main" xmlns:w14="http://schemas.microsoft.com/office/word/2010/wordml" xmlns:w15="http://schemas.microsoft.com/office/word/2012/wordml" xmlns:w16cex="http://schemas.microsoft.com/office/word/2018/wordml/cex" xmlns:w16cid="http://schemas.microsoft.com/office/word/2016/wordml/cid" xmlns:w16="http://schemas.microsoft.com/office/word/2018/wordml" xmlns:w16se="http://schemas.microsoft.com/office/word/2015/wordml/symex" mc:Ignorable="w14 w15 w16se w16cid w16 w16cex">
+<w:styles xmlns:mc="http://schemas.openxmlformats.org/markup-compatibility/2006" xmlns:r="http://schemas.openxmlformats.org/officeDocument/2006/relationships" xmlns:w="http://schemas.openxmlformats.org/wordprocessingml/2006/main" xmlns:w14="http://schemas.microsoft.com/office/word/2010/wordml" xmlns:w15="http://schemas.microsoft.com/office/word/2012/wordml" xmlns:w16cex="http://schemas.microsoft.com/office/word/2018/wordml/cex" xmlns:w16cid="http://schemas.microsoft.com/office/word/2016/wordml/cid" xmlns:w16="http://schemas.microsoft.com/office/word/2018/wordml" xmlns:w16du="http://schemas.microsoft.com/office/word/2023/wordml/word16du" xmlns:w16sdtdh="http://schemas.microsoft.com/office/word/2020/wordml/sdtdatahash" xmlns:w16sdtfl="http://schemas.microsoft.com/office/word/2024/wordml/sdtformatlock" xmlns:w16se="http://schemas.microsoft.com/office/word/2015/wordml/symex" mc:Ignorable="w14 w15 w16se w16cid w16 w16cex w16sdtdh w16sdtfl w16du">
   <w:docDefaults>
     <w:rPrDefault>
       <w:rPr>

</xml_diff>